<commit_message>
docs(readme): requirements, portable setup, Ollama on Windows, detector steps
Requirements table (system, Python, memory, disk per part, GPU optional with
measured CPU slowdown), CityFlow pinned, installs with requirements-lock.txt,
the dashboard on a new laptop (build_replays.py; which pages work), Ollama for
Windows with mirrored networking, PyTorch cu126 before the perception extra,
and the symlinks for the large files. Every measured number is tagged against
the fresh-clone record. Report appendix C gets the same steps and a summary of
the check; report.docx/pdf rebuilt.

Co-Authored-By: Claude Opus 5.5 <noreply@anthropic.com>
</commit_message>
<xml_diff>
--- a/docs/report/report.docx
+++ b/docs/report/report.docx
@@ -952,7 +952,7 @@
         <w:rPr>
           <w:lang w:val="en-GB"/>
         </w:rPr>
-        <w:t xml:space="preserve">own code, whose baseline results it reproduces exactly; along the way we found a bug in their</w:t>
+        <w:t xml:space="preserve">own code, whose baseline results it reproduces to within the simulator’s own run-to-run noise; along the way we found a bug in their</w:t>
       </w:r>
       <w:r>
         <w:rPr>
@@ -3336,19 +3336,31 @@
         <w:rPr>
           <w:lang w:val="en-GB"/>
         </w:rPr>
-        <w:t xml:space="preserve">environment reproduces their FixedTime and MaxPressure throughput, queue length and waiting</w:t>
-      </w:r>
-      <w:r>
-        <w:rPr>
-          <w:lang w:val="en-GB"/>
-        </w:rPr>
-        <w:t xml:space="preserve"> </w:t>
-      </w:r>
-      <w:r>
-        <w:rPr>
-          <w:lang w:val="en-GB"/>
-        </w:rPr>
-        <w:t xml:space="preserve">time exactly on all three of their datasets (Section 4.2). We also found that CoLLMLight’s</w:t>
+        <w:t xml:space="preserve">environment reproduces their FixedTime and MaxPressure throughput and queue length exactly on</w:t>
+      </w:r>
+      <w:r>
+        <w:rPr>
+          <w:lang w:val="en-GB"/>
+        </w:rPr>
+        <w:t xml:space="preserve"> </w:t>
+      </w:r>
+      <w:r>
+        <w:rPr>
+          <w:lang w:val="en-GB"/>
+        </w:rPr>
+        <w:t xml:space="preserve">all three of their datasets, and their waiting time to within CityFlow’s own run-to-run noise</w:t>
+      </w:r>
+      <w:r>
+        <w:rPr>
+          <w:lang w:val="en-GB"/>
+        </w:rPr>
+        <w:t xml:space="preserve"> </w:t>
+      </w:r>
+      <w:r>
+        <w:rPr>
+          <w:lang w:val="en-GB"/>
+        </w:rPr>
+        <w:t xml:space="preserve">(Section 4.2). We also found that CoLLMLight’s</w:t>
       </w:r>
       <w:r>
         <w:rPr>
@@ -10459,43 +10471,55 @@
         <w:rPr>
           <w:lang w:val="en-GB"/>
         </w:rPr>
-        <w:t xml:space="preserve">We run CityFlow with lane changing switched off. With lane changing on, CityFlow’s results</w:t>
-      </w:r>
-      <w:r>
-        <w:rPr>
-          <w:lang w:val="en-GB"/>
-        </w:rPr>
-        <w:t xml:space="preserve"> </w:t>
-      </w:r>
-      <w:r>
-        <w:rPr>
-          <w:lang w:val="en-GB"/>
-        </w:rPr>
-        <w:t xml:space="preserve">depend very slightly on which read-only queries are made between steps, so two controllers that</w:t>
-      </w:r>
-      <w:r>
-        <w:rPr>
-          <w:lang w:val="en-GB"/>
-        </w:rPr>
-        <w:t xml:space="preserve"> </w:t>
-      </w:r>
-      <w:r>
-        <w:rPr>
-          <w:lang w:val="en-GB"/>
-        </w:rPr>
-        <w:t xml:space="preserve">query different things could see different traffic. With it off, the same phase sequence always</w:t>
-      </w:r>
-      <w:r>
-        <w:rPr>
-          <w:lang w:val="en-GB"/>
-        </w:rPr>
-        <w:t xml:space="preserve"> </w:t>
-      </w:r>
-      <w:r>
-        <w:rPr>
-          <w:lang w:val="en-GB"/>
-        </w:rPr>
-        <w:t xml:space="preserve">gives exactly the same run, which we verified.</w:t>
+        <w:t xml:space="preserve">We run CityFlow with lane changing switched off. With lane changing on, CityFlow is not exactly</w:t>
+      </w:r>
+      <w:r>
+        <w:rPr>
+          <w:lang w:val="en-GB"/>
+        </w:rPr>
+        <w:t xml:space="preserve"> </w:t>
+      </w:r>
+      <w:r>
+        <w:rPr>
+          <w:lang w:val="en-GB"/>
+        </w:rPr>
+        <w:t xml:space="preserve">repeatable: the same run, repeated with identical inputs, gives slightly different travel times.</w:t>
+      </w:r>
+      <w:r>
+        <w:rPr>
+          <w:lang w:val="en-GB"/>
+        </w:rPr>
+        <w:t xml:space="preserve"> </w:t>
+      </w:r>
+      <w:r>
+        <w:rPr>
+          <w:lang w:val="en-GB"/>
+        </w:rPr>
+        <w:t xml:space="preserve">With it off, the same phase sequence always gives exactly the same run, which we verified by</w:t>
+      </w:r>
+      <w:r>
+        <w:rPr>
+          <w:lang w:val="en-GB"/>
+        </w:rPr>
+        <w:t xml:space="preserve"> </w:t>
+      </w:r>
+      <w:r>
+        <w:rPr>
+          <w:lang w:val="en-GB"/>
+        </w:rPr>
+        <w:t xml:space="preserve">re-running every deterministic experiment from a fresh copy of the repository</w:t>
+      </w:r>
+      <w:r>
+        <w:rPr>
+          <w:lang w:val="en-GB"/>
+        </w:rPr>
+        <w:t xml:space="preserve"> </w:t>
+      </w:r>
+      <w:r>
+        <w:rPr>
+          <w:lang w:val="en-GB"/>
+        </w:rPr>
+        <w:t xml:space="preserve">(Appendix C).</w:t>
       </w:r>
     </w:p>
     <w:p>
@@ -10734,91 +10758,115 @@
         <w:rPr>
           <w:lang w:val="en-GB"/>
         </w:rPr>
-        <w:t xml:space="preserve">Table 4.1 compares the two implementations under their metric definitions.</w:t>
-      </w:r>
-      <w:r>
-        <w:rPr>
-          <w:lang w:val="en-GB"/>
-        </w:rPr>
-        <w:t xml:space="preserve"> </w:t>
-      </w:r>
-      <w:r>
-        <w:rPr>
-          <w:lang w:val="en-GB"/>
-        </w:rPr>
-        <w:t xml:space="preserve">Throughput, queue length and waiting time are identical floating-point numbers for both</w:t>
-      </w:r>
-      <w:r>
-        <w:rPr>
-          <w:lang w:val="en-GB"/>
-        </w:rPr>
-        <w:t xml:space="preserve"> </w:t>
-      </w:r>
-      <w:r>
-        <w:rPr>
-          <w:lang w:val="en-GB"/>
-        </w:rPr>
-        <w:t xml:space="preserve">controllers on all three datasets. Average travel time under their definition is identical in</w:t>
-      </w:r>
-      <w:r>
-        <w:rPr>
-          <w:lang w:val="en-GB"/>
-        </w:rPr>
-        <w:t xml:space="preserve"> </w:t>
-      </w:r>
-      <w:r>
-        <w:rPr>
-          <w:lang w:val="en-GB"/>
-        </w:rPr>
-        <w:t xml:space="preserve">all but one of the six runs; there, and in CityFlow’s own average travel time, the differences</w:t>
-      </w:r>
-      <w:r>
-        <w:rPr>
-          <w:lang w:val="en-GB"/>
-        </w:rPr>
-        <w:t xml:space="preserve"> </w:t>
-      </w:r>
-      <w:r>
-        <w:rPr>
-          <w:lang w:val="en-GB"/>
-        </w:rPr>
-        <w:t xml:space="preserve">are in the sixth significant digit or beyond. We traced them to CityFlow’s lane changing: with lane changing on, extra</w:t>
-      </w:r>
-      <w:r>
-        <w:rPr>
-          <w:lang w:val="en-GB"/>
-        </w:rPr>
-        <w:t xml:space="preserve"> </w:t>
-      </w:r>
-      <w:r>
-        <w:rPr>
-          <w:lang w:val="en-GB"/>
-        </w:rPr>
-        <w:t xml:space="preserve">read-only queries alter the run in the sixth significant digit, and their environment makes</w:t>
-      </w:r>
-      <w:r>
-        <w:rPr>
-          <w:lang w:val="en-GB"/>
-        </w:rPr>
-        <w:t xml:space="preserve"> </w:t>
-      </w:r>
-      <w:r>
-        <w:rPr>
-          <w:lang w:val="en-GB"/>
-        </w:rPr>
-        <w:t xml:space="preserve">more such queries than ours. With lane changing off, the result is bit-for-bit identical whatever</w:t>
-      </w:r>
-      <w:r>
-        <w:rPr>
-          <w:lang w:val="en-GB"/>
-        </w:rPr>
-        <w:t xml:space="preserve"> </w:t>
-      </w:r>
-      <w:r>
-        <w:rPr>
-          <w:lang w:val="en-GB"/>
-        </w:rPr>
-        <w:t xml:space="preserve">is queried. We therefore consider the pipeline validated.</w:t>
+        <w:t xml:space="preserve">Table 4.1 compares one run of each implementation under their metric</w:t>
+      </w:r>
+      <w:r>
+        <w:rPr>
+          <w:lang w:val="en-GB"/>
+        </w:rPr>
+        <w:t xml:space="preserve"> </w:t>
+      </w:r>
+      <w:r>
+        <w:rPr>
+          <w:lang w:val="en-GB"/>
+        </w:rPr>
+        <w:t xml:space="preserve">definitions. Throughput, queue length and waiting time are identical floating-point numbers for</w:t>
+      </w:r>
+      <w:r>
+        <w:rPr>
+          <w:lang w:val="en-GB"/>
+        </w:rPr>
+        <w:t xml:space="preserve"> </w:t>
+      </w:r>
+      <w:r>
+        <w:rPr>
+          <w:lang w:val="en-GB"/>
+        </w:rPr>
+        <w:t xml:space="preserve">both controllers on all three datasets. Average travel time under their definition is identical</w:t>
+      </w:r>
+      <w:r>
+        <w:rPr>
+          <w:lang w:val="en-GB"/>
+        </w:rPr>
+        <w:t xml:space="preserve"> </w:t>
+      </w:r>
+      <w:r>
+        <w:rPr>
+          <w:lang w:val="en-GB"/>
+        </w:rPr>
+        <w:t xml:space="preserve">in all but one of the six runs; there, and in CityFlow’s own average travel time, the differences</w:t>
+      </w:r>
+      <w:r>
+        <w:rPr>
+          <w:lang w:val="en-GB"/>
+        </w:rPr>
+        <w:t xml:space="preserve"> </w:t>
+      </w:r>
+      <w:r>
+        <w:rPr>
+          <w:lang w:val="en-GB"/>
+        </w:rPr>
+        <w:t xml:space="preserve">are in the sixth significant digit or beyond. These comparisons need lane changing on, and with</w:t>
+      </w:r>
+      <w:r>
+        <w:rPr>
+          <w:lang w:val="en-GB"/>
+        </w:rPr>
+        <w:t xml:space="preserve"> </w:t>
+      </w:r>
+      <w:r>
+        <w:rPr>
+          <w:lang w:val="en-GB"/>
+        </w:rPr>
+        <w:t xml:space="preserve">it CityFlow is not exactly repeatable: repeating the same run, in their code or ours, moves the</w:t>
+      </w:r>
+      <w:r>
+        <w:rPr>
+          <w:lang w:val="en-GB"/>
+        </w:rPr>
+        <w:t xml:space="preserve"> </w:t>
+      </w:r>
+      <w:r>
+        <w:rPr>
+          <w:lang w:val="en-GB"/>
+        </w:rPr>
+        <w:t xml:space="preserve">average travel time by similar or larger amounts, while throughput and their queue length never</w:t>
+      </w:r>
+      <w:r>
+        <w:rPr>
+          <w:lang w:val="en-GB"/>
+        </w:rPr>
+        <w:t xml:space="preserve"> </w:t>
+      </w:r>
+      <w:r>
+        <w:rPr>
+          <w:lang w:val="en-GB"/>
+        </w:rPr>
+        <w:t xml:space="preserve">changed (Appendix C). The remaining differences are therefore within the simulator’s</w:t>
+      </w:r>
+      <w:r>
+        <w:rPr>
+          <w:lang w:val="en-GB"/>
+        </w:rPr>
+        <w:t xml:space="preserve"> </w:t>
+      </w:r>
+      <w:r>
+        <w:rPr>
+          <w:lang w:val="en-GB"/>
+        </w:rPr>
+        <w:t xml:space="preserve">own noise. (An earlier draft attributed them to extra read-only queries; the fresh-clone check</w:t>
+      </w:r>
+      <w:r>
+        <w:rPr>
+          <w:lang w:val="en-GB"/>
+        </w:rPr>
+        <w:t xml:space="preserve"> </w:t>
+      </w:r>
+      <w:r>
+        <w:rPr>
+          <w:lang w:val="en-GB"/>
+        </w:rPr>
+        <w:t xml:space="preserve">showed that test could not separate the two.) We therefore consider the pipeline validated.</w:t>
       </w:r>
     </w:p>
     <w:bookmarkStart w:id="60" w:name="_aa1066327d81ef78c9555e442bec3df03fa1eae"/>
@@ -43916,7 +43964,19 @@
         <w:rPr>
           <w:lang w:val="en-GB"/>
         </w:rPr>
-        <w:t xml:space="preserve">baseline results exactly when driven the same way, and the validation exposed a bug in their</w:t>
+        <w:t xml:space="preserve">baseline results when driven the same way (throughput and queue exactly, waiting and travel times</w:t>
+      </w:r>
+      <w:r>
+        <w:rPr>
+          <w:lang w:val="en-GB"/>
+        </w:rPr>
+        <w:t xml:space="preserve"> </w:t>
+      </w:r>
+      <w:r>
+        <w:rPr>
+          <w:lang w:val="en-GB"/>
+        </w:rPr>
+        <w:t xml:space="preserve">to within the simulator’s run-to-run noise), and the validation exposed a bug in their</w:t>
       </w:r>
       <w:r>
         <w:rPr>
@@ -53098,7 +53158,7 @@
         <w:rPr>
           <w:rStyle w:val="CommentTok"/>
         </w:rPr>
-        <w:t xml:space="preserve"># environment</w:t>
+        <w:t xml:space="preserve"># environment (exact versions: requirements-lock.txt)</w:t>
       </w:r>
       <w:r>
         <w:br/>
@@ -53164,7 +53224,34 @@
         <w:rPr>
           <w:rStyle w:val="NormalTok"/>
         </w:rPr>
-        <w:t xml:space="preserve"> clone https://github.com/cityflow-project/CityFlow.git ../CityFlow </w:t>
+        <w:t xml:space="preserve"> clone https://github.com/cityflow-project/CityFlow.git ../CityFlow</w:t>
+      </w:r>
+      <w:r>
+        <w:br/>
+      </w:r>
+      <w:r>
+        <w:rPr>
+          <w:rStyle w:val="FunctionTok"/>
+        </w:rPr>
+        <w:t xml:space="preserve">git</w:t>
+      </w:r>
+      <w:r>
+        <w:rPr>
+          <w:rStyle w:val="NormalTok"/>
+        </w:rPr>
+        <w:t xml:space="preserve"> </w:t>
+      </w:r>
+      <w:r>
+        <w:rPr>
+          <w:rStyle w:val="AttributeTok"/>
+        </w:rPr>
+        <w:t xml:space="preserve">-C</w:t>
+      </w:r>
+      <w:r>
+        <w:rPr>
+          <w:rStyle w:val="NormalTok"/>
+        </w:rPr>
+        <w:t xml:space="preserve"> ../CityFlow checkout 81ee0f4 </w:t>
       </w:r>
       <w:r>
         <w:rPr>
@@ -53203,6 +53290,33 @@
         <w:rPr>
           <w:rStyle w:val="NormalTok"/>
         </w:rPr>
+        <w:t xml:space="preserve"> install torch==2.14.1 torchvision==0.29.1 </w:t>
+      </w:r>
+      <w:r>
+        <w:rPr>
+          <w:rStyle w:val="AttributeTok"/>
+        </w:rPr>
+        <w:t xml:space="preserve">--index-url</w:t>
+      </w:r>
+      <w:r>
+        <w:rPr>
+          <w:rStyle w:val="NormalTok"/>
+        </w:rPr>
+        <w:t xml:space="preserve"> https://download.pytorch.org/whl/cu126</w:t>
+      </w:r>
+      <w:r>
+        <w:br/>
+      </w:r>
+      <w:r>
+        <w:rPr>
+          <w:rStyle w:val="ExtensionTok"/>
+        </w:rPr>
+        <w:t xml:space="preserve">pip</w:t>
+      </w:r>
+      <w:r>
+        <w:rPr>
+          <w:rStyle w:val="NormalTok"/>
+        </w:rPr>
         <w:t xml:space="preserve"> install </w:t>
       </w:r>
       <w:r>
@@ -53224,6 +53338,24 @@
         <w:t xml:space="preserve">".[dev,dashboard,perception]"</w:t>
       </w:r>
       <w:r>
+        <w:rPr>
+          <w:rStyle w:val="NormalTok"/>
+        </w:rPr>
+        <w:t xml:space="preserve"> </w:t>
+      </w:r>
+      <w:r>
+        <w:rPr>
+          <w:rStyle w:val="AttributeTok"/>
+        </w:rPr>
+        <w:t xml:space="preserve">-c</w:t>
+      </w:r>
+      <w:r>
+        <w:rPr>
+          <w:rStyle w:val="NormalTok"/>
+        </w:rPr>
+        <w:t xml:space="preserve"> requirements-lock.txt</w:t>
+      </w:r>
+      <w:r>
         <w:br/>
       </w:r>
       <w:r>
@@ -53290,6 +53422,18 @@
         <w:t xml:space="preserve">sh</w:t>
       </w:r>
       <w:r>
+        <w:rPr>
+          <w:rStyle w:val="NormalTok"/>
+        </w:rPr>
+        <w:t xml:space="preserve">         </w:t>
+      </w:r>
+      <w:r>
+        <w:rPr>
+          <w:rStyle w:val="CommentTok"/>
+        </w:rPr>
+        <w:t xml:space="preserve"># or Ollama for Windows (README)</w:t>
+      </w:r>
+      <w:r>
         <w:br/>
       </w:r>
       <w:r>
@@ -54217,6 +54361,33 @@
         <w:rPr>
           <w:rStyle w:val="CommentTok"/>
         </w:rPr>
+        <w:t xml:space="preserve"># Dashboard replays, from the committed runs</w:t>
+      </w:r>
+      <w:r>
+        <w:br/>
+      </w:r>
+      <w:r>
+        <w:rPr>
+          <w:rStyle w:val="ExtensionTok"/>
+        </w:rPr>
+        <w:t xml:space="preserve">python</w:t>
+      </w:r>
+      <w:r>
+        <w:rPr>
+          <w:rStyle w:val="NormalTok"/>
+        </w:rPr>
+        <w:t xml:space="preserve"> scripts/build_replays.py</w:t>
+      </w:r>
+      <w:r>
+        <w:br/>
+      </w:r>
+      <w:r>
+        <w:br/>
+      </w:r>
+      <w:r>
+        <w:rPr>
+          <w:rStyle w:val="CommentTok"/>
+        </w:rPr>
         <w:t xml:space="preserve"># This report</w:t>
       </w:r>
       <w:r>
@@ -54331,7 +54502,7 @@
         <w:rPr>
           <w:rStyle w:val="NormalTok"/>
         </w:rPr>
-        <w:t xml:space="preserve">         make_camera_error make_model_size make_perception_results make_report</w:t>
+        <w:t xml:space="preserve">         make_camera_error make_model_size make_perception_results make_reproducibility make_report</w:t>
       </w:r>
       <w:r>
         <w:rPr>
@@ -54419,78 +54590,18 @@
           <w:rStyle w:val="AttributeTok"/>
         </w:rPr>
         <w:t xml:space="preserve">--check</w:t>
-      </w:r>
-    </w:p>
-    <w:p>
-      <w:pPr>
-        <w:pStyle w:val="FirstParagraph"/>
-      </w:pPr>
-      <w:r>
-        <w:rPr>
-          <w:lang w:val="en-GB"/>
-        </w:rPr>
-        <w:t xml:space="preserve">LLM runs are not bit-for-bit repeatable on a GPU (Section 6.2): a re-run gives slightly different</w:t>
-      </w:r>
-      <w:r>
-        <w:rPr>
-          <w:lang w:val="en-GB"/>
-        </w:rPr>
-        <w:t xml:space="preserve"> </w:t>
-      </w:r>
-      <w:r>
-        <w:rPr>
-          <w:lang w:val="en-GB"/>
-        </w:rPr>
-        <w:t xml:space="preserve">numbers. The logged decisions reproduce each run exactly, and the dashboard’s replays are kept only</w:t>
-      </w:r>
-      <w:r>
-        <w:rPr>
-          <w:lang w:val="en-GB"/>
-        </w:rPr>
-        <w:t xml:space="preserve"> </w:t>
-      </w:r>
-      <w:r>
-        <w:rPr>
-          <w:lang w:val="en-GB"/>
-        </w:rPr>
-        <w:t xml:space="preserve">when they do. The hosted model of the model-size study needs an API key in a git-ignored</w:t>
-      </w:r>
-      <w:r>
-        <w:rPr>
-          <w:lang w:val="en-GB"/>
-        </w:rPr>
-        <w:t xml:space="preserve"> </w:t>
-      </w:r>
-      <w:r>
-        <w:rPr>
-          <w:rStyle w:val="VerbatimChar"/>
-          <w:lang w:val="en-GB"/>
-        </w:rPr>
-        <w:t xml:space="preserve">.env</w:t>
-      </w:r>
-      <w:r>
-        <w:rPr>
-          <w:lang w:val="en-GB"/>
-        </w:rPr>
-        <w:t xml:space="preserve"> </w:t>
-      </w:r>
-      <w:r>
-        <w:rPr>
-          <w:lang w:val="en-GB"/>
-        </w:rPr>
-        <w:t xml:space="preserve">file and is subject to the provider’s rate limits.</w:t>
       </w:r>
     </w:p>
     <w:p>
       <w:pPr>
         <w:pStyle w:val="Heading2"/>
       </w:pPr>
-      <w:bookmarkStart w:id="247" w:name="_f1a7d7208d3df94c885cfc21fa3da5b78a30b3b"/>
-      <w:r>
-        <w:rPr>
-          <w:lang w:val="en-GB"/>
-        </w:rPr>
-        <w:t xml:space="preserve">C.3  Data not in the repository</w:t>
+      <w:bookmarkStart w:id="247" w:name="_b1b37e3b848db63d7ad019807d816def78ab09d"/>
+      <w:r>
+        <w:rPr>
+          <w:lang w:val="en-GB"/>
+        </w:rPr>
+        <w:t xml:space="preserve">C.3  A check from a fresh clone</w:t>
       </w:r>
       <w:bookmarkEnd w:id="247"/>
     </w:p>
@@ -54502,6 +54613,361 @@
         <w:rPr>
           <w:lang w:val="en-GB"/>
         </w:rPr>
+        <w:t xml:space="preserve">To test these steps, the repository was cloned from GitHub into an empty folder and set up from</w:t>
+      </w:r>
+      <w:r>
+        <w:rPr>
+          <w:lang w:val="en-GB"/>
+        </w:rPr>
+        <w:t xml:space="preserve"> </w:t>
+      </w:r>
+      <w:r>
+        <w:rPr>
+          <w:lang w:val="en-GB"/>
+        </w:rPr>
+        <w:t xml:space="preserve">the README alone, and every deterministic result was run again</w:t>
+      </w:r>
+      <w:r>
+        <w:rPr>
+          <w:lang w:val="en-GB"/>
+        </w:rPr>
+        <w:t xml:space="preserve"> </w:t>
+      </w:r>
+      <w:r>
+        <w:rPr>
+          <w:lang w:val="en-GB"/>
+        </w:rPr>
+        <w:t xml:space="preserve">(</w:t>
+      </w:r>
+      <w:r>
+        <w:rPr>
+          <w:rStyle w:val="VerbatimChar"/>
+          <w:lang w:val="en-GB"/>
+        </w:rPr>
+        <w:t xml:space="preserve">docs/reproducibility.md</w:t>
+      </w:r>
+      <w:r>
+        <w:rPr>
+          <w:lang w:val="en-GB"/>
+        </w:rPr>
+        <w:t xml:space="preserve">, generated from</w:t>
+      </w:r>
+      <w:r>
+        <w:rPr>
+          <w:lang w:val="en-GB"/>
+        </w:rPr>
+        <w:t xml:space="preserve"> </w:t>
+      </w:r>
+      <w:r>
+        <w:rPr>
+          <w:rStyle w:val="VerbatimChar"/>
+          <w:lang w:val="en-GB"/>
+        </w:rPr>
+        <w:t xml:space="preserve">outputs/reproducibility/fresh_clone.json</w:t>
+      </w:r>
+      <w:r>
+        <w:rPr>
+          <w:lang w:val="en-GB"/>
+        </w:rPr>
+        <w:t xml:space="preserve">). All</w:t>
+      </w:r>
+      <w:r>
+        <w:rPr>
+          <w:lang w:val="en-GB"/>
+        </w:rPr>
+        <w:t xml:space="preserve"> </w:t>
+      </w:r>
+      <w:r>
+        <w:rPr>
+          <w:lang w:val="en-GB"/>
+        </w:rPr>
+        <w:t xml:space="preserve">42</w:t>
+      </w:r>
+      <w:r>
+        <w:rPr>
+          <w:lang w:val="en-GB"/>
+        </w:rPr>
+        <w:t xml:space="preserve"> </w:t>
+      </w:r>
+      <w:r>
+        <w:rPr>
+          <w:lang w:val="en-GB"/>
+        </w:rPr>
+        <w:t xml:space="preserve">of the 42</w:t>
+      </w:r>
+      <w:r>
+        <w:rPr>
+          <w:lang w:val="en-GB"/>
+        </w:rPr>
+        <w:t xml:space="preserve"> </w:t>
+      </w:r>
+      <w:r>
+        <w:rPr>
+          <w:lang w:val="en-GB"/>
+        </w:rPr>
+        <w:t xml:space="preserve">runs of the fixed-time, Webster, MaxPressure and preemption</w:t>
+      </w:r>
+      <w:r>
+        <w:rPr>
+          <w:lang w:val="en-GB"/>
+        </w:rPr>
+        <w:t xml:space="preserve"> </w:t>
+      </w:r>
+      <w:r>
+        <w:rPr>
+          <w:lang w:val="en-GB"/>
+        </w:rPr>
+        <w:t xml:space="preserve">controllers came out identical in every metric, as did the detector’s test-split evaluation</w:t>
+      </w:r>
+      <w:r>
+        <w:rPr>
+          <w:lang w:val="en-GB"/>
+        </w:rPr>
+        <w:t xml:space="preserve"> </w:t>
+      </w:r>
+      <w:r>
+        <w:rPr>
+          <w:lang w:val="en-GB"/>
+        </w:rPr>
+        <w:t xml:space="preserve">(mAP50 0.563</w:t>
+      </w:r>
+      <w:r>
+        <w:rPr>
+          <w:lang w:val="en-GB"/>
+        </w:rPr>
+        <w:t xml:space="preserve">, mAP50-95 0.375</w:t>
+      </w:r>
+      <w:r>
+        <w:rPr>
+          <w:lang w:val="en-GB"/>
+        </w:rPr>
+        <w:t xml:space="preserve">, and the whole camera error model), the IDD label</w:t>
+      </w:r>
+      <w:r>
+        <w:rPr>
+          <w:lang w:val="en-GB"/>
+        </w:rPr>
+        <w:t xml:space="preserve"> </w:t>
+      </w:r>
+      <w:r>
+        <w:rPr>
+          <w:lang w:val="en-GB"/>
+        </w:rPr>
+        <w:t xml:space="preserve">conversion and the dashboard’s replays. A 600</w:t>
+      </w:r>
+      <w:r>
+        <w:rPr>
+          <w:lang w:val="en-GB"/>
+        </w:rPr>
+        <w:t xml:space="preserve"> </w:t>
+      </w:r>
+      <w:r>
+        <w:rPr>
+          <w:lang w:val="en-GB"/>
+        </w:rPr>
+        <w:t xml:space="preserve">s run of the pre-registered LLM arm repeated</w:t>
+      </w:r>
+      <w:r>
+        <w:rPr>
+          <w:lang w:val="en-GB"/>
+        </w:rPr>
+        <w:t xml:space="preserve"> </w:t>
+      </w:r>
+      <w:r>
+        <w:rPr>
+          <w:lang w:val="en-GB"/>
+        </w:rPr>
+        <w:t xml:space="preserve">the committed run exactly, in all 121</w:t>
+      </w:r>
+      <w:r>
+        <w:rPr>
+          <w:lang w:val="en-GB"/>
+        </w:rPr>
+        <w:t xml:space="preserve"> </w:t>
+      </w:r>
+      <w:r>
+        <w:rPr>
+          <w:lang w:val="en-GB"/>
+        </w:rPr>
+        <w:t xml:space="preserve">answers. The check found gaps</w:t>
+      </w:r>
+      <w:r>
+        <w:rPr>
+          <w:lang w:val="en-GB"/>
+        </w:rPr>
+        <w:t xml:space="preserve"> </w:t>
+      </w:r>
+      <w:r>
+        <w:rPr>
+          <w:lang w:val="en-GB"/>
+        </w:rPr>
+        <w:t xml:space="preserve">in the setup instructions, not in the results: tests and checks that failed in a clean</w:t>
+      </w:r>
+      <w:r>
+        <w:rPr>
+          <w:lang w:val="en-GB"/>
+        </w:rPr>
+        <w:t xml:space="preserve"> </w:t>
+      </w:r>
+      <w:r>
+        <w:rPr>
+          <w:lang w:val="en-GB"/>
+        </w:rPr>
+        <w:t xml:space="preserve">install, an evaluation script that read an absolute path, a PyTorch build the GPU driver could</w:t>
+      </w:r>
+      <w:r>
+        <w:rPr>
+          <w:lang w:val="en-GB"/>
+        </w:rPr>
+        <w:t xml:space="preserve"> </w:t>
+      </w:r>
+      <w:r>
+        <w:rPr>
+          <w:lang w:val="en-GB"/>
+        </w:rPr>
+        <w:t xml:space="preserve">not use, and no pinned versions. Each was fixed, and the affected steps were run again in the</w:t>
+      </w:r>
+      <w:r>
+        <w:rPr>
+          <w:lang w:val="en-GB"/>
+        </w:rPr>
+        <w:t xml:space="preserve"> </w:t>
+      </w:r>
+      <w:r>
+        <w:rPr>
+          <w:lang w:val="en-GB"/>
+        </w:rPr>
+        <w:t xml:space="preserve">same clone.</w:t>
+      </w:r>
+    </w:p>
+    <w:p>
+      <w:pPr>
+        <w:pStyle w:val="BodyText"/>
+      </w:pPr>
+      <w:r>
+        <w:rPr>
+          <w:lang w:val="en-GB"/>
+        </w:rPr>
+        <w:t xml:space="preserve">The one part that did not repeat exactly was CityFlow with lane changing on, which only the</w:t>
+      </w:r>
+      <w:r>
+        <w:rPr>
+          <w:lang w:val="en-GB"/>
+        </w:rPr>
+        <w:t xml:space="preserve"> </w:t>
+      </w:r>
+      <w:r>
+        <w:rPr>
+          <w:lang w:val="en-GB"/>
+        </w:rPr>
+        <w:t xml:space="preserve">validation’s matched runs use: the same run, repeated, gives a slightly different average</w:t>
+      </w:r>
+      <w:r>
+        <w:rPr>
+          <w:lang w:val="en-GB"/>
+        </w:rPr>
+        <w:t xml:space="preserve"> </w:t>
+      </w:r>
+      <w:r>
+        <w:rPr>
+          <w:lang w:val="en-GB"/>
+        </w:rPr>
+        <w:t xml:space="preserve">travel time, in CoLLMLight’s code as in ours, while throughput and their queue length never</w:t>
+      </w:r>
+      <w:r>
+        <w:rPr>
+          <w:lang w:val="en-GB"/>
+        </w:rPr>
+        <w:t xml:space="preserve"> </w:t>
+      </w:r>
+      <w:r>
+        <w:rPr>
+          <w:lang w:val="en-GB"/>
+        </w:rPr>
+        <w:t xml:space="preserve">changed (Section 4.2).</w:t>
+      </w:r>
+    </w:p>
+    <w:p>
+      <w:pPr>
+        <w:pStyle w:val="BodyText"/>
+      </w:pPr>
+      <w:r>
+        <w:rPr>
+          <w:lang w:val="en-GB"/>
+        </w:rPr>
+        <w:t xml:space="preserve">LLM runs are not guaranteed to be bit-for-bit repeatable on a GPU (Section 6.2): a re-run can</w:t>
+      </w:r>
+      <w:r>
+        <w:rPr>
+          <w:lang w:val="en-GB"/>
+        </w:rPr>
+        <w:t xml:space="preserve"> </w:t>
+      </w:r>
+      <w:r>
+        <w:rPr>
+          <w:lang w:val="en-GB"/>
+        </w:rPr>
+        <w:t xml:space="preserve">give slightly different numbers. The logged decisions reproduce each run exactly, and the dashboard’s replays are kept only</w:t>
+      </w:r>
+      <w:r>
+        <w:rPr>
+          <w:lang w:val="en-GB"/>
+        </w:rPr>
+        <w:t xml:space="preserve"> </w:t>
+      </w:r>
+      <w:r>
+        <w:rPr>
+          <w:lang w:val="en-GB"/>
+        </w:rPr>
+        <w:t xml:space="preserve">when they do. The hosted model of the model-size study needs an API key in a git-ignored</w:t>
+      </w:r>
+      <w:r>
+        <w:rPr>
+          <w:lang w:val="en-GB"/>
+        </w:rPr>
+        <w:t xml:space="preserve"> </w:t>
+      </w:r>
+      <w:r>
+        <w:rPr>
+          <w:rStyle w:val="VerbatimChar"/>
+          <w:lang w:val="en-GB"/>
+        </w:rPr>
+        <w:t xml:space="preserve">.env</w:t>
+      </w:r>
+      <w:r>
+        <w:rPr>
+          <w:lang w:val="en-GB"/>
+        </w:rPr>
+        <w:t xml:space="preserve"> </w:t>
+      </w:r>
+      <w:r>
+        <w:rPr>
+          <w:lang w:val="en-GB"/>
+        </w:rPr>
+        <w:t xml:space="preserve">file and is subject to the provider’s rate limits.</w:t>
+      </w:r>
+    </w:p>
+    <w:p>
+      <w:pPr>
+        <w:pStyle w:val="Heading2"/>
+      </w:pPr>
+      <w:bookmarkStart w:id="248" w:name="_f1a7d7208d3df94c885cfc21fa3da5b78a30b3b"/>
+      <w:r>
+        <w:rPr>
+          <w:lang w:val="en-GB"/>
+        </w:rPr>
+        <w:t xml:space="preserve">C.4  Data not in the repository</w:t>
+      </w:r>
+      <w:bookmarkEnd w:id="248"/>
+    </w:p>
+    <w:p>
+      <w:pPr>
+        <w:pStyle w:val="FirstParagraph"/>
+      </w:pPr>
+      <w:r>
+        <w:rPr>
+          <w:lang w:val="en-GB"/>
+        </w:rPr>
         <w:t xml:space="preserve">IDD is downloaded from its authors after registration and is not redistributed; the detector</w:t>
       </w:r>
       <w:r>
@@ -54588,14 +55054,14 @@
       <w:pPr>
         <w:pStyle w:val="Heading1"/>
       </w:pPr>
-      <w:bookmarkStart w:id="248" w:name="_086bac4e67713e203ac452c84c6ab568ef7c00d"/>
+      <w:bookmarkStart w:id="249" w:name="_086bac4e67713e203ac452c84c6ab568ef7c00d"/>
       <w:r>
         <w:rPr>
           <w:lang w:val="en-GB"/>
         </w:rPr>
         <w:t xml:space="preserve">Appendix D: Hardware and Software</w:t>
       </w:r>
-      <w:bookmarkEnd w:id="248"/>
+      <w:bookmarkEnd w:id="249"/>
     </w:p>
     <w:p>
       <w:pPr>
@@ -55266,29 +55732,29 @@
       <w:pPr>
         <w:pStyle w:val="Heading1"/>
       </w:pPr>
-      <w:bookmarkStart w:id="249" w:name="_d29032218aa0f2cf2ca251e119c8e791d5fe681"/>
+      <w:bookmarkStart w:id="250" w:name="_d29032218aa0f2cf2ca251e119c8e791d5fe681"/>
       <w:r>
         <w:rPr>
           <w:lang w:val="en-GB"/>
         </w:rPr>
         <w:t xml:space="preserve">Appendix E: Full Tables</w:t>
       </w:r>
-      <w:bookmarkEnd w:id="249"/>
+      <w:bookmarkEnd w:id="250"/>
     </w:p>
     <w:p>
       <w:pPr>
         <w:pStyle w:val="Heading2"/>
       </w:pPr>
-      <w:bookmarkStart w:id="250" w:name="_291feaf310bbeffacc7aa16ce7b48cdae7c2d4e"/>
+      <w:bookmarkStart w:id="251" w:name="_291feaf310bbeffacc7aa16ce7b48cdae7c2d4e"/>
       <w:r>
         <w:rPr>
           <w:lang w:val="en-GB"/>
         </w:rPr>
         <w:t xml:space="preserve">E.1  Every baseline run on the Indian network</w:t>
       </w:r>
-      <w:bookmarkEnd w:id="250"/>
+      <w:bookmarkEnd w:id="251"/>
     </w:p>
-    <w:bookmarkStart w:id="251" w:name="_1381867e18a546900156cdd90586aac01f9a94d"/>
+    <w:bookmarkStart w:id="252" w:name="_1381867e18a546900156cdd90586aac01f9a94d"/>
     <w:p>
       <w:pPr>
         <w:pStyle w:val="TableCaption"/>
@@ -59774,21 +60240,21 @@
         </w:tc>
       </w:tr>
     </w:tbl>
-    <w:bookmarkEnd w:id="251"/>
+    <w:bookmarkEnd w:id="252"/>
     <w:p>
       <w:pPr>
         <w:pStyle w:val="Heading2"/>
       </w:pPr>
-      <w:bookmarkStart w:id="252" w:name="_ef33cce5956cc5d4dd6532df1596c2a8761dc2e"/>
+      <w:bookmarkStart w:id="253" w:name="_ef33cce5956cc5d4dd6532df1596c2a8761dc2e"/>
       <w:r>
         <w:rPr>
           <w:lang w:val="en-GB"/>
         </w:rPr>
         <w:t xml:space="preserve">E.2  MaxPressure decision-interval sweep</w:t>
       </w:r>
-      <w:bookmarkEnd w:id="252"/>
+      <w:bookmarkEnd w:id="253"/>
     </w:p>
-    <w:bookmarkStart w:id="253" w:name="_ff228455dfdbdf7696e6650b562240a3bde9f43"/>
+    <w:bookmarkStart w:id="254" w:name="_ff228455dfdbdf7696e6650b562240a3bde9f43"/>
     <w:p>
       <w:pPr>
         <w:pStyle w:val="TableCaption"/>
@@ -60517,21 +60983,21 @@
         </w:tc>
       </w:tr>
     </w:tbl>
-    <w:bookmarkEnd w:id="253"/>
+    <w:bookmarkEnd w:id="254"/>
     <w:p>
       <w:pPr>
         <w:pStyle w:val="Heading2"/>
       </w:pPr>
-      <w:bookmarkStart w:id="254" w:name="_33baafe7b58ef8b7f366f0674c3b148202d8c71"/>
+      <w:bookmarkStart w:id="255" w:name="_33baafe7b58ef8b7f366f0674c3b148202d8c71"/>
       <w:r>
         <w:rPr>
           <w:lang w:val="en-GB"/>
         </w:rPr>
         <w:t xml:space="preserve">E.3  Validation against CoLLMLight</w:t>
       </w:r>
-      <w:bookmarkEnd w:id="254"/>
+      <w:bookmarkEnd w:id="255"/>
     </w:p>
-    <w:bookmarkStart w:id="255" w:name="_0d485eb96b918586974e07b5f3c2d07f71785ff"/>
+    <w:bookmarkStart w:id="256" w:name="_0d485eb96b918586974e07b5f3c2d07f71785ff"/>
     <w:p>
       <w:pPr>
         <w:pStyle w:val="TableCaption"/>
@@ -62137,21 +62603,21 @@
         </w:tc>
       </w:tr>
     </w:tbl>
-    <w:bookmarkEnd w:id="255"/>
+    <w:bookmarkEnd w:id="256"/>
     <w:p>
       <w:pPr>
         <w:pStyle w:val="Heading2"/>
       </w:pPr>
-      <w:bookmarkStart w:id="256" w:name="_7be5695a5691b4096eaaf6d0f6c8ee6b39d0f39"/>
+      <w:bookmarkStart w:id="257" w:name="_7be5695a5691b4096eaaf6d0f6c8ee6b39d0f39"/>
       <w:r>
         <w:rPr>
           <w:lang w:val="en-GB"/>
         </w:rPr>
         <w:t xml:space="preserve">E.4  What the models chose in the benchmark</w:t>
       </w:r>
-      <w:bookmarkEnd w:id="256"/>
+      <w:bookmarkEnd w:id="257"/>
     </w:p>
-    <w:bookmarkStart w:id="257" w:name="_e8bf0440d16b51d8228ec4f408cf1790813556f"/>
+    <w:bookmarkStart w:id="258" w:name="_e8bf0440d16b51d8228ec4f408cf1790813556f"/>
     <w:p>
       <w:pPr>
         <w:pStyle w:val="TableCaption"/>
@@ -64436,21 +64902,21 @@
         </w:tc>
       </w:tr>
     </w:tbl>
-    <w:bookmarkEnd w:id="257"/>
+    <w:bookmarkEnd w:id="258"/>
     <w:p>
       <w:pPr>
         <w:pStyle w:val="Heading2"/>
       </w:pPr>
-      <w:bookmarkStart w:id="258" w:name="_2cecc61853a534c2978badc41f069aa753a54fd"/>
+      <w:bookmarkStart w:id="259" w:name="_2cecc61853a534c2978badc41f069aa753a54fd"/>
       <w:r>
         <w:rPr>
           <w:lang w:val="en-GB"/>
         </w:rPr>
         <w:t xml:space="preserve">E.5  LLM arm under camera errors</w:t>
       </w:r>
-      <w:bookmarkEnd w:id="258"/>
+      <w:bookmarkEnd w:id="259"/>
     </w:p>
-    <w:bookmarkStart w:id="259" w:name="_4c0c174b5ccce230e0a3f78086898c6e6754cf9"/>
+    <w:bookmarkStart w:id="260" w:name="_4c0c174b5ccce230e0a3f78086898c6e6754cf9"/>
     <w:p>
       <w:pPr>
         <w:pStyle w:val="TableCaption"/>
@@ -65398,21 +65864,21 @@
         </w:tc>
       </w:tr>
     </w:tbl>
-    <w:bookmarkEnd w:id="259"/>
+    <w:bookmarkEnd w:id="260"/>
     <w:p>
       <w:pPr>
         <w:pStyle w:val="Heading2"/>
       </w:pPr>
-      <w:bookmarkStart w:id="260" w:name="_c924263306f87ca932128507e445056bbde8672"/>
+      <w:bookmarkStart w:id="261" w:name="_c924263306f87ca932128507e445056bbde8672"/>
       <w:r>
         <w:rPr>
           <w:lang w:val="en-GB"/>
         </w:rPr>
         <w:t xml:space="preserve">E.6  Hosted model runs (exploratory)</w:t>
       </w:r>
-      <w:bookmarkEnd w:id="260"/>
+      <w:bookmarkEnd w:id="261"/>
     </w:p>
-    <w:bookmarkStart w:id="261" w:name="_631e470c3e6ac8a869aa68585f49189f1a70861"/>
+    <w:bookmarkStart w:id="262" w:name="_631e470c3e6ac8a869aa68585f49189f1a70861"/>
     <w:p>
       <w:pPr>
         <w:pStyle w:val="TableCaption"/>
@@ -66346,7 +66812,7 @@
         </w:tc>
       </w:tr>
     </w:tbl>
-    <w:bookmarkEnd w:id="261"/>
+    <w:bookmarkEnd w:id="262"/>
     <w:sectPr>
       <w:footerReference w:type="default" r:id="rIdFooterTS"/>
       <w:pgSz w:w="11906" w:h="16838"/>

</xml_diff>